<commit_message>
Atualização da documentação de experimentação
</commit_message>
<xml_diff>
--- a/Documentation/Protocolo para garantia de confiabilidade.docx
+++ b/Documentation/Protocolo para garantia de confiabilidade.docx
@@ -2348,28 +2348,15 @@
     </w:p>
     <w:p>
       <w:pPr>
-        <w:pStyle w:val="PargrafodaLista"/>
-        <w:numPr>
-          <w:ilvl w:val="1"/>
-          <w:numId w:val="1"/>
-        </w:numPr>
         <w:jc w:val="both"/>
         <w:rPr>
           <w:b/>
           <w:bCs/>
         </w:rPr>
       </w:pPr>
-      <w:r>
-        <w:rPr>
-          <w:b/>
-          <w:bCs/>
-        </w:rPr>
-        <w:t>Retorno de resultados do teste de validação:</w:t>
-      </w:r>
-    </w:p>
-    <w:p>
-      <w:pPr>
-        <w:ind w:left="708"/>
+    </w:p>
+    <w:p>
+      <w:pPr>
         <w:jc w:val="both"/>
         <w:rPr>
           <w:b/>
@@ -2379,7 +2366,6 @@
     </w:p>
     <w:p>
       <w:pPr>
-        <w:ind w:left="708"/>
         <w:jc w:val="both"/>
         <w:rPr>
           <w:b/>
@@ -2389,7 +2375,6 @@
     </w:p>
     <w:p>
       <w:pPr>
-        <w:ind w:left="708"/>
         <w:jc w:val="both"/>
         <w:rPr>
           <w:b/>
@@ -2399,7 +2384,6 @@
     </w:p>
     <w:p>
       <w:pPr>
-        <w:ind w:left="708"/>
         <w:jc w:val="both"/>
         <w:rPr>
           <w:b/>
@@ -2409,7 +2393,6 @@
     </w:p>
     <w:p>
       <w:pPr>
-        <w:ind w:left="708"/>
         <w:jc w:val="both"/>
         <w:rPr>
           <w:b/>
@@ -2419,7 +2402,6 @@
     </w:p>
     <w:p>
       <w:pPr>
-        <w:ind w:left="708"/>
         <w:jc w:val="both"/>
         <w:rPr>
           <w:b/>
@@ -2429,7 +2411,6 @@
     </w:p>
     <w:p>
       <w:pPr>
-        <w:ind w:left="708"/>
         <w:jc w:val="both"/>
         <w:rPr>
           <w:b/>
@@ -2439,11 +2420,6 @@
     </w:p>
     <w:p>
       <w:pPr>
-        <w:pStyle w:val="PargrafodaLista"/>
-        <w:numPr>
-          <w:ilvl w:val="0"/>
-          <w:numId w:val="48"/>
-        </w:numPr>
         <w:jc w:val="both"/>
         <w:rPr>
           <w:b/>
@@ -2452,263 +2428,9 @@
       </w:pPr>
       <w:r>
         <w:rPr>
-          <w:b/>
-          <w:bCs/>
+          <w:noProof/>
         </w:rPr>
         <w:lastRenderedPageBreak/>
-        <w:t>Observações importantes:</w:t>
-      </w:r>
-    </w:p>
-    <w:p>
-      <w:pPr>
-        <w:ind w:left="708"/>
-        <w:jc w:val="both"/>
-        <w:rPr>
-          <w:b/>
-          <w:bCs/>
-        </w:rPr>
-      </w:pPr>
-      <w:r>
-        <w:rPr>
-          <w:b/>
-          <w:bCs/>
-        </w:rPr>
-        <w:t>Parâmetros diferentes entre a implementação atual e o Artigo:</w:t>
-      </w:r>
-    </w:p>
-    <w:p>
-      <w:pPr>
-        <w:pStyle w:val="PargrafodaLista"/>
-        <w:numPr>
-          <w:ilvl w:val="0"/>
-          <w:numId w:val="45"/>
-        </w:numPr>
-        <w:jc w:val="both"/>
-        <w:rPr>
-          <w:b/>
-          <w:bCs/>
-        </w:rPr>
-      </w:pPr>
-      <w:proofErr w:type="spellStart"/>
-      <w:r>
-        <w:rPr>
-          <w:b/>
-          <w:bCs/>
-        </w:rPr>
-        <w:t>Weight</w:t>
-      </w:r>
-      <w:proofErr w:type="spellEnd"/>
-      <w:r>
-        <w:rPr>
-          <w:b/>
-          <w:bCs/>
-        </w:rPr>
-        <w:t xml:space="preserve"> </w:t>
-      </w:r>
-      <w:proofErr w:type="spellStart"/>
-      <w:r>
-        <w:rPr>
-          <w:b/>
-          <w:bCs/>
-        </w:rPr>
-        <w:t>decay</w:t>
-      </w:r>
-      <w:proofErr w:type="spellEnd"/>
-      <w:r>
-        <w:rPr>
-          <w:b/>
-          <w:bCs/>
-        </w:rPr>
-        <w:t xml:space="preserve"> </w:t>
-      </w:r>
-      <w:proofErr w:type="spellStart"/>
-      <w:r>
-        <w:rPr>
-          <w:b/>
-          <w:bCs/>
-        </w:rPr>
-        <w:t>vs</w:t>
-      </w:r>
-      <w:proofErr w:type="spellEnd"/>
-      <w:r>
-        <w:rPr>
-          <w:b/>
-          <w:bCs/>
-        </w:rPr>
-        <w:t xml:space="preserve"> L2 </w:t>
-      </w:r>
-      <w:proofErr w:type="spellStart"/>
-      <w:r>
-        <w:rPr>
-          <w:b/>
-          <w:bCs/>
-        </w:rPr>
-        <w:t>regularizer</w:t>
-      </w:r>
-      <w:proofErr w:type="spellEnd"/>
-    </w:p>
-    <w:p>
-      <w:pPr>
-        <w:numPr>
-          <w:ilvl w:val="0"/>
-          <w:numId w:val="38"/>
-        </w:numPr>
-        <w:jc w:val="both"/>
-      </w:pPr>
-      <w:r>
-        <w:t xml:space="preserve">Você aplicou </w:t>
-      </w:r>
-      <w:proofErr w:type="spellStart"/>
-      <w:r>
-        <w:t>kernel_regularizer</w:t>
-      </w:r>
-      <w:proofErr w:type="spellEnd"/>
-      <w:r>
-        <w:t>=</w:t>
-      </w:r>
-      <w:proofErr w:type="gramStart"/>
-      <w:r>
-        <w:t>regularizers.l</w:t>
-      </w:r>
-      <w:proofErr w:type="gramEnd"/>
-      <w:r>
-        <w:t>2</w:t>
-      </w:r>
-      <w:r>
-        <w:t xml:space="preserve"> </w:t>
-      </w:r>
-      <w:r>
-        <w:t>(</w:t>
-      </w:r>
-      <w:proofErr w:type="spellStart"/>
-      <w:r>
-        <w:t>weight_decay</w:t>
-      </w:r>
-      <w:proofErr w:type="spellEnd"/>
-      <w:r>
-        <w:t>) nas camadas do modelo</w:t>
-      </w:r>
-      <w:r>
-        <w:t xml:space="preserve">. </w:t>
-      </w:r>
-      <w:r>
-        <w:t xml:space="preserve">Isso adiciona a soma dos quadrados dos pesos multiplicada por </w:t>
-      </w:r>
-      <w:proofErr w:type="spellStart"/>
-      <w:r>
-        <w:t>weight_decay</w:t>
-      </w:r>
-      <w:proofErr w:type="spellEnd"/>
-      <w:r>
-        <w:t xml:space="preserve"> à perda. O </w:t>
-      </w:r>
-      <w:r>
-        <w:t>artigo</w:t>
-      </w:r>
-      <w:r>
-        <w:t xml:space="preserve"> usava </w:t>
-      </w:r>
-      <w:proofErr w:type="spellStart"/>
-      <w:r>
-        <w:rPr>
-          <w:i/>
-          <w:iCs/>
-        </w:rPr>
-        <w:t>weight</w:t>
-      </w:r>
-      <w:proofErr w:type="spellEnd"/>
-      <w:r>
-        <w:rPr>
-          <w:i/>
-          <w:iCs/>
-        </w:rPr>
-        <w:t xml:space="preserve"> </w:t>
-      </w:r>
-      <w:proofErr w:type="spellStart"/>
-      <w:r>
-        <w:rPr>
-          <w:i/>
-          <w:iCs/>
-        </w:rPr>
-        <w:t>decay</w:t>
-      </w:r>
-      <w:proofErr w:type="spellEnd"/>
-      <w:r>
-        <w:t xml:space="preserve"> em </w:t>
-      </w:r>
-      <w:proofErr w:type="spellStart"/>
-      <w:r>
-        <w:t>Caffe</w:t>
-      </w:r>
-      <w:proofErr w:type="spellEnd"/>
-      <w:r>
-        <w:t xml:space="preserve">: a correspondência é correta na prática, mas há implementações modernas que usam </w:t>
-      </w:r>
-      <w:proofErr w:type="spellStart"/>
-      <w:r>
-        <w:rPr>
-          <w:i/>
-          <w:iCs/>
-        </w:rPr>
-        <w:t>decoupled</w:t>
-      </w:r>
-      <w:proofErr w:type="spellEnd"/>
-      <w:r>
-        <w:t xml:space="preserve"> </w:t>
-      </w:r>
-      <w:proofErr w:type="spellStart"/>
-      <w:r>
-        <w:t>weight</w:t>
-      </w:r>
-      <w:proofErr w:type="spellEnd"/>
-      <w:r>
-        <w:t xml:space="preserve"> </w:t>
-      </w:r>
-      <w:proofErr w:type="spellStart"/>
-      <w:r>
-        <w:t>decay</w:t>
-      </w:r>
-      <w:proofErr w:type="spellEnd"/>
-      <w:r>
-        <w:t xml:space="preserve"> (</w:t>
-      </w:r>
-      <w:proofErr w:type="spellStart"/>
-      <w:r>
-        <w:t>AdamW</w:t>
-      </w:r>
-      <w:proofErr w:type="spellEnd"/>
-      <w:r>
-        <w:t xml:space="preserve"> </w:t>
-      </w:r>
-      <w:proofErr w:type="spellStart"/>
-      <w:r>
-        <w:t>style</w:t>
-      </w:r>
-      <w:proofErr w:type="spellEnd"/>
-      <w:r>
-        <w:t xml:space="preserve">) que não é idêntico. Para reproduzir fielmente os números, sua forma (L2 na </w:t>
-      </w:r>
-      <w:proofErr w:type="spellStart"/>
-      <w:r>
-        <w:t>loss</w:t>
-      </w:r>
-      <w:proofErr w:type="spellEnd"/>
-      <w:r>
-        <w:t>) é apropriada.</w:t>
-      </w:r>
-    </w:p>
-    <w:p>
-      <w:pPr>
-        <w:jc w:val="both"/>
-        <w:rPr>
-          <w:b/>
-          <w:bCs/>
-        </w:rPr>
-      </w:pPr>
-      <w:r>
-        <w:rPr>
-          <w:noProof/>
-        </w:rPr>
         <mc:AlternateContent>
           <mc:Choice Requires="wps">
             <w:drawing>
@@ -3216,7 +2938,6 @@
         <w:ind w:left="2148"/>
       </w:pPr>
       <w:r>
-        <w:lastRenderedPageBreak/>
         <w:t xml:space="preserve">- </w:t>
       </w:r>
       <w:r>
@@ -3547,6 +3268,7 @@
         <w:jc w:val="both"/>
       </w:pPr>
       <w:r>
+        <w:lastRenderedPageBreak/>
         <w:t>A</w:t>
       </w:r>
       <w:r>
@@ -3685,7 +3407,15 @@
       </w:r>
       <w:proofErr w:type="spellEnd"/>
       <w:r>
-        <w:t xml:space="preserve"> encoder da</w:t>
+        <w:t xml:space="preserve"> </w:t>
+      </w:r>
+      <w:proofErr w:type="spellStart"/>
+      <w:r>
+        <w:t>encoder</w:t>
+      </w:r>
+      <w:proofErr w:type="spellEnd"/>
+      <w:r>
+        <w:t xml:space="preserve"> da</w:t>
       </w:r>
       <w:r>
         <w:t xml:space="preserve"> arquitetura da BERT</w:t>
@@ -4736,6 +4466,7 @@
           <w:noProof/>
           <w:color w:val="0D0D0D" w:themeColor="text1" w:themeTint="F2"/>
         </w:rPr>
+        <w:lastRenderedPageBreak/>
         <w:drawing>
           <wp:inline distT="0" distB="0" distL="0" distR="0" wp14:anchorId="0A5330E2" wp14:editId="4A89CA37">
             <wp:extent cx="5228514" cy="2055377"/>
@@ -5953,6 +5684,7 @@
           <w:bCs/>
           <w:noProof/>
         </w:rPr>
+        <w:lastRenderedPageBreak/>
         <w:drawing>
           <wp:inline distT="0" distB="0" distL="0" distR="0" wp14:anchorId="7FC37BB8" wp14:editId="1B12141C">
             <wp:extent cx="5400040" cy="2649220"/>
@@ -6170,204 +5902,6 @@
           <w:bCs/>
         </w:rPr>
       </w:pPr>
-    </w:p>
-    <w:p>
-      <w:pPr>
-        <w:pStyle w:val="PargrafodaLista"/>
-        <w:ind w:left="708"/>
-        <w:jc w:val="both"/>
-        <w:rPr>
-          <w:b/>
-          <w:bCs/>
-        </w:rPr>
-      </w:pPr>
-    </w:p>
-    <w:p>
-      <w:pPr>
-        <w:pStyle w:val="PargrafodaLista"/>
-        <w:numPr>
-          <w:ilvl w:val="0"/>
-          <w:numId w:val="60"/>
-        </w:numPr>
-        <w:rPr>
-          <w:b/>
-          <w:bCs/>
-        </w:rPr>
-      </w:pPr>
-      <w:r>
-        <w:rPr>
-          <w:b/>
-          <w:bCs/>
-        </w:rPr>
-        <w:lastRenderedPageBreak/>
-        <w:t>Retorno de resultados do teste de validação:</w:t>
-      </w:r>
-    </w:p>
-    <w:p>
-      <w:pPr>
-        <w:ind w:left="1776"/>
-        <w:rPr>
-          <w:b/>
-          <w:bCs/>
-        </w:rPr>
-      </w:pPr>
-      <w:r>
-        <w:rPr>
-          <w:b/>
-          <w:bCs/>
-        </w:rPr>
-        <w:t>OBSERVAÇÃO 1:</w:t>
-      </w:r>
-    </w:p>
-    <w:p>
-      <w:pPr>
-        <w:ind w:left="708"/>
-        <w:rPr>
-          <w:b/>
-          <w:bCs/>
-        </w:rPr>
-      </w:pPr>
-      <w:r>
-        <w:rPr>
-          <w:b/>
-          <w:bCs/>
-        </w:rPr>
-        <w:drawing>
-          <wp:inline distT="0" distB="0" distL="0" distR="0" wp14:anchorId="3C150F9E" wp14:editId="782FE7EF">
-            <wp:extent cx="5400040" cy="781685"/>
-            <wp:effectExtent l="0" t="0" r="0" b="0"/>
-            <wp:docPr id="1005225276" name="Imagem 1"/>
-            <wp:cNvGraphicFramePr>
-              <a:graphicFrameLocks xmlns:a="http://schemas.openxmlformats.org/drawingml/2006/main" noChangeAspect="1"/>
-            </wp:cNvGraphicFramePr>
-            <a:graphic xmlns:a="http://schemas.openxmlformats.org/drawingml/2006/main">
-              <a:graphicData uri="http://schemas.openxmlformats.org/drawingml/2006/picture">
-                <pic:pic xmlns:pic="http://schemas.openxmlformats.org/drawingml/2006/picture">
-                  <pic:nvPicPr>
-                    <pic:cNvPr id="1005225276" name=""/>
-                    <pic:cNvPicPr/>
-                  </pic:nvPicPr>
-                  <pic:blipFill>
-                    <a:blip r:embed="rId22"/>
-                    <a:stretch>
-                      <a:fillRect/>
-                    </a:stretch>
-                  </pic:blipFill>
-                  <pic:spPr>
-                    <a:xfrm>
-                      <a:off x="0" y="0"/>
-                      <a:ext cx="5400040" cy="781685"/>
-                    </a:xfrm>
-                    <a:prstGeom prst="rect">
-                      <a:avLst/>
-                    </a:prstGeom>
-                  </pic:spPr>
-                </pic:pic>
-              </a:graphicData>
-            </a:graphic>
-          </wp:inline>
-        </w:drawing>
-      </w:r>
-    </w:p>
-    <w:p>
-      <w:pPr>
-        <w:ind w:left="708"/>
-        <w:rPr>
-          <w:b/>
-          <w:bCs/>
-        </w:rPr>
-      </w:pPr>
-      <w:r>
-        <w:rPr>
-          <w:b/>
-          <w:bCs/>
-        </w:rPr>
-        <w:drawing>
-          <wp:inline distT="0" distB="0" distL="0" distR="0" wp14:anchorId="064BD09C" wp14:editId="18C07C17">
-            <wp:extent cx="5400040" cy="3547745"/>
-            <wp:effectExtent l="0" t="0" r="0" b="0"/>
-            <wp:docPr id="190380662" name="Imagem 1"/>
-            <wp:cNvGraphicFramePr>
-              <a:graphicFrameLocks xmlns:a="http://schemas.openxmlformats.org/drawingml/2006/main" noChangeAspect="1"/>
-            </wp:cNvGraphicFramePr>
-            <a:graphic xmlns:a="http://schemas.openxmlformats.org/drawingml/2006/main">
-              <a:graphicData uri="http://schemas.openxmlformats.org/drawingml/2006/picture">
-                <pic:pic xmlns:pic="http://schemas.openxmlformats.org/drawingml/2006/picture">
-                  <pic:nvPicPr>
-                    <pic:cNvPr id="190380662" name=""/>
-                    <pic:cNvPicPr/>
-                  </pic:nvPicPr>
-                  <pic:blipFill>
-                    <a:blip r:embed="rId23"/>
-                    <a:stretch>
-                      <a:fillRect/>
-                    </a:stretch>
-                  </pic:blipFill>
-                  <pic:spPr>
-                    <a:xfrm>
-                      <a:off x="0" y="0"/>
-                      <a:ext cx="5400040" cy="3547745"/>
-                    </a:xfrm>
-                    <a:prstGeom prst="rect">
-                      <a:avLst/>
-                    </a:prstGeom>
-                  </pic:spPr>
-                </pic:pic>
-              </a:graphicData>
-            </a:graphic>
-          </wp:inline>
-        </w:drawing>
-      </w:r>
-    </w:p>
-    <w:p>
-      <w:pPr>
-        <w:ind w:left="708"/>
-        <w:rPr>
-          <w:b/>
-          <w:bCs/>
-          <w:color w:val="C00000"/>
-        </w:rPr>
-      </w:pPr>
-      <w:r>
-        <w:rPr>
-          <w:b/>
-          <w:bCs/>
-          <w:color w:val="C00000"/>
-        </w:rPr>
-        <w:t xml:space="preserve">OBSERVAÇÃO: </w:t>
-      </w:r>
-      <w:r>
-        <w:rPr>
-          <w:b/>
-          <w:bCs/>
-          <w:color w:val="C00000"/>
-        </w:rPr>
-        <w:t>E</w:t>
-      </w:r>
-      <w:r>
-        <w:rPr>
-          <w:b/>
-          <w:bCs/>
-          <w:color w:val="C00000"/>
-        </w:rPr>
-        <w:t>vidências para o protocolo de experimentação</w:t>
-      </w:r>
-      <w:r>
-        <w:rPr>
-          <w:b/>
-          <w:bCs/>
-          <w:color w:val="C00000"/>
-        </w:rPr>
-        <w:t xml:space="preserve"> (trechos/afirmações-chave)</w:t>
-      </w:r>
-      <w:r>
-        <w:rPr>
-          <w:b/>
-          <w:bCs/>
-          <w:color w:val="C00000"/>
-        </w:rPr>
-        <w:t xml:space="preserve"> estão destacadas no artigo.</w:t>
-      </w:r>
     </w:p>
     <w:p>
       <w:pPr>

</xml_diff>